<commit_message>
fix(omml-math): format all card titles, steps, and worksheet formulas into standard OMML / KaTeX math
</commit_message>
<xml_diff>
--- a/2-2_三角函數的定義與性質_學生學習單.docx
+++ b/2-2_三角函數的定義與性質_學生學習單.docx
@@ -403,7 +403,76 @@
                 <w:color w:val="78350F"/>
                 <w:sz w:val="22"/>
               </w:rPr>
-              <w:t>重點 2：特別角 30°、45°、60° 精確值速記表</w:t>
+              <w:t xml:space="preserve">重點 2：特別角 </w:t>
+            </w:r>
+            <m:oMath>
+              <m:sSup>
+                <m:e>
+                  <m:r>
+                    <m:t>30</m:t>
+                  </m:r>
+                </m:e>
+                <m:sup>
+                  <m:r>
+                    <m:t>∘</m:t>
+                  </m:r>
+                </m:sup>
+              </m:sSup>
+            </m:oMath>
+            <w:r>
+              <w:rPr>
+                <w:rFonts w:ascii="微軟正黑體" w:hAnsi="微軟正黑體"/>
+                <w:b/>
+                <w:color w:val="78350F"/>
+                <w:sz w:val="22"/>
+              </w:rPr>
+              <w:t>、</w:t>
+            </w:r>
+            <m:oMath>
+              <m:sSup>
+                <m:e>
+                  <m:r>
+                    <m:t>45</m:t>
+                  </m:r>
+                </m:e>
+                <m:sup>
+                  <m:r>
+                    <m:t>∘</m:t>
+                  </m:r>
+                </m:sup>
+              </m:sSup>
+            </m:oMath>
+            <w:r>
+              <w:rPr>
+                <w:rFonts w:ascii="微軟正黑體" w:hAnsi="微軟正黑體"/>
+                <w:b/>
+                <w:color w:val="78350F"/>
+                <w:sz w:val="22"/>
+              </w:rPr>
+              <w:t>、</w:t>
+            </w:r>
+            <m:oMath>
+              <m:sSup>
+                <m:e>
+                  <m:r>
+                    <m:t>60</m:t>
+                  </m:r>
+                </m:e>
+                <m:sup>
+                  <m:r>
+                    <m:t>∘</m:t>
+                  </m:r>
+                </m:sup>
+              </m:sSup>
+            </m:oMath>
+            <w:r>
+              <w:rPr>
+                <w:rFonts w:ascii="微軟正黑體" w:hAnsi="微軟正黑體"/>
+                <w:b/>
+                <w:color w:val="78350F"/>
+                <w:sz w:val="22"/>
+              </w:rPr>
+              <w:t xml:space="preserve"> 精確值速記表</w:t>
             </w:r>
           </w:p>
           <w:p>

</xml_diff>